<commit_message>
fix solution in calculator to minimize amount iterating
</commit_message>
<xml_diff>
--- a/решение.docx
+++ b/решение.docx
@@ -19,7 +19,254 @@
           <w:szCs w:val="24"/>
           <w:lang w:eastAsia="ru-RU"/>
         </w:rPr>
-        <w:t xml:space="preserve">Мне нужно написать алгоритм для решения задачи на возможность соединения труб на поле width х length клеток одной ломаной, замкнутой линией. Изначально трубы заданы как список объектов Pipe с атрибутами: x, y, color, position. Первые два - координаты в матрице width х length, где y - значение столбца (вертикаль, от 0 до width-1 слева-направо), а x - значение строки (горизонталь, от 0 до length-1 сверху-вниз). У Pipe с значением color=0 (черный цвет) есть всего 4 варианта позиций (position) - значения 0, 1, 2 и 3; у тех, что со значением color=1 (белые) позиции 0, 1, 2, 3, 4, 5, 6, 7, 8, 9, 10, 11. Мне нужно пройтись по следующему алгоритму с несколькими условиями, упрощающими мой перебор и найти существует ли решение </w:t>
+        <w:t>З</w:t>
+      </w:r>
+      <w:r>
+        <w:rPr>
+          <w:rFonts w:eastAsia="Times New Roman" w:cstheme="minorHAnsi"/>
+          <w:sz w:val="24"/>
+          <w:szCs w:val="24"/>
+          <w:lang w:eastAsia="ru-RU"/>
+        </w:rPr>
+        <w:t>адач</w:t>
+      </w:r>
+      <w:r>
+        <w:rPr>
+          <w:rFonts w:eastAsia="Times New Roman" w:cstheme="minorHAnsi"/>
+          <w:sz w:val="24"/>
+          <w:szCs w:val="24"/>
+          <w:lang w:eastAsia="ru-RU"/>
+        </w:rPr>
+        <w:t>а</w:t>
+      </w:r>
+      <w:r>
+        <w:rPr>
+          <w:rFonts w:eastAsia="Times New Roman" w:cstheme="minorHAnsi"/>
+          <w:sz w:val="24"/>
+          <w:szCs w:val="24"/>
+          <w:lang w:eastAsia="ru-RU"/>
+        </w:rPr>
+        <w:t xml:space="preserve"> на возможность соединения труб на поле </w:t>
+      </w:r>
+      <w:proofErr w:type="spellStart"/>
+      <w:r>
+        <w:rPr>
+          <w:rFonts w:eastAsia="Times New Roman" w:cstheme="minorHAnsi"/>
+          <w:sz w:val="24"/>
+          <w:szCs w:val="24"/>
+          <w:lang w:eastAsia="ru-RU"/>
+        </w:rPr>
+        <w:t>width</w:t>
+      </w:r>
+      <w:proofErr w:type="spellEnd"/>
+      <w:r>
+        <w:rPr>
+          <w:rFonts w:eastAsia="Times New Roman" w:cstheme="minorHAnsi"/>
+          <w:sz w:val="24"/>
+          <w:szCs w:val="24"/>
+          <w:lang w:eastAsia="ru-RU"/>
+        </w:rPr>
+        <w:t xml:space="preserve"> х </w:t>
+      </w:r>
+      <w:proofErr w:type="spellStart"/>
+      <w:r>
+        <w:rPr>
+          <w:rFonts w:eastAsia="Times New Roman" w:cstheme="minorHAnsi"/>
+          <w:sz w:val="24"/>
+          <w:szCs w:val="24"/>
+          <w:lang w:eastAsia="ru-RU"/>
+        </w:rPr>
+        <w:t>length</w:t>
+      </w:r>
+      <w:proofErr w:type="spellEnd"/>
+      <w:r>
+        <w:rPr>
+          <w:rFonts w:eastAsia="Times New Roman" w:cstheme="minorHAnsi"/>
+          <w:sz w:val="24"/>
+          <w:szCs w:val="24"/>
+          <w:lang w:eastAsia="ru-RU"/>
+        </w:rPr>
+        <w:t xml:space="preserve"> клеток одной ломаной, замкнутой линией. Изначально трубы заданы как список объектов </w:t>
+      </w:r>
+      <w:proofErr w:type="spellStart"/>
+      <w:r>
+        <w:rPr>
+          <w:rFonts w:eastAsia="Times New Roman" w:cstheme="minorHAnsi"/>
+          <w:sz w:val="24"/>
+          <w:szCs w:val="24"/>
+          <w:lang w:eastAsia="ru-RU"/>
+        </w:rPr>
+        <w:t>Pipe</w:t>
+      </w:r>
+      <w:proofErr w:type="spellEnd"/>
+      <w:r>
+        <w:rPr>
+          <w:rFonts w:eastAsia="Times New Roman" w:cstheme="minorHAnsi"/>
+          <w:sz w:val="24"/>
+          <w:szCs w:val="24"/>
+          <w:lang w:eastAsia="ru-RU"/>
+        </w:rPr>
+        <w:t xml:space="preserve"> с атрибутами: x, y, </w:t>
+      </w:r>
+      <w:proofErr w:type="spellStart"/>
+      <w:r>
+        <w:rPr>
+          <w:rFonts w:eastAsia="Times New Roman" w:cstheme="minorHAnsi"/>
+          <w:sz w:val="24"/>
+          <w:szCs w:val="24"/>
+          <w:lang w:eastAsia="ru-RU"/>
+        </w:rPr>
+        <w:t>color</w:t>
+      </w:r>
+      <w:proofErr w:type="spellEnd"/>
+      <w:r>
+        <w:rPr>
+          <w:rFonts w:eastAsia="Times New Roman" w:cstheme="minorHAnsi"/>
+          <w:sz w:val="24"/>
+          <w:szCs w:val="24"/>
+          <w:lang w:eastAsia="ru-RU"/>
+        </w:rPr>
+        <w:t xml:space="preserve">, </w:t>
+      </w:r>
+      <w:proofErr w:type="spellStart"/>
+      <w:r>
+        <w:rPr>
+          <w:rFonts w:eastAsia="Times New Roman" w:cstheme="minorHAnsi"/>
+          <w:sz w:val="24"/>
+          <w:szCs w:val="24"/>
+          <w:lang w:eastAsia="ru-RU"/>
+        </w:rPr>
+        <w:t>position</w:t>
+      </w:r>
+      <w:proofErr w:type="spellEnd"/>
+      <w:r>
+        <w:rPr>
+          <w:rFonts w:eastAsia="Times New Roman" w:cstheme="minorHAnsi"/>
+          <w:sz w:val="24"/>
+          <w:szCs w:val="24"/>
+          <w:lang w:eastAsia="ru-RU"/>
+        </w:rPr>
+        <w:t xml:space="preserve">. Первые два - координаты в матрице </w:t>
+      </w:r>
+      <w:proofErr w:type="spellStart"/>
+      <w:r>
+        <w:rPr>
+          <w:rFonts w:eastAsia="Times New Roman" w:cstheme="minorHAnsi"/>
+          <w:sz w:val="24"/>
+          <w:szCs w:val="24"/>
+          <w:lang w:eastAsia="ru-RU"/>
+        </w:rPr>
+        <w:t>width</w:t>
+      </w:r>
+      <w:proofErr w:type="spellEnd"/>
+      <w:r>
+        <w:rPr>
+          <w:rFonts w:eastAsia="Times New Roman" w:cstheme="minorHAnsi"/>
+          <w:sz w:val="24"/>
+          <w:szCs w:val="24"/>
+          <w:lang w:eastAsia="ru-RU"/>
+        </w:rPr>
+        <w:t xml:space="preserve"> х </w:t>
+      </w:r>
+      <w:proofErr w:type="spellStart"/>
+      <w:r>
+        <w:rPr>
+          <w:rFonts w:eastAsia="Times New Roman" w:cstheme="minorHAnsi"/>
+          <w:sz w:val="24"/>
+          <w:szCs w:val="24"/>
+          <w:lang w:eastAsia="ru-RU"/>
+        </w:rPr>
+        <w:t>length</w:t>
+      </w:r>
+      <w:proofErr w:type="spellEnd"/>
+      <w:r>
+        <w:rPr>
+          <w:rFonts w:eastAsia="Times New Roman" w:cstheme="minorHAnsi"/>
+          <w:sz w:val="24"/>
+          <w:szCs w:val="24"/>
+          <w:lang w:eastAsia="ru-RU"/>
+        </w:rPr>
+        <w:t xml:space="preserve">, где y - значение столбца (вертикаль, от 0 до width-1 слева-направо), а x - значение строки (горизонталь, от 0 до length-1 сверху-вниз). У </w:t>
+      </w:r>
+      <w:proofErr w:type="spellStart"/>
+      <w:r>
+        <w:rPr>
+          <w:rFonts w:eastAsia="Times New Roman" w:cstheme="minorHAnsi"/>
+          <w:sz w:val="24"/>
+          <w:szCs w:val="24"/>
+          <w:lang w:eastAsia="ru-RU"/>
+        </w:rPr>
+        <w:t>Pipe</w:t>
+      </w:r>
+      <w:proofErr w:type="spellEnd"/>
+      <w:r>
+        <w:rPr>
+          <w:rFonts w:eastAsia="Times New Roman" w:cstheme="minorHAnsi"/>
+          <w:sz w:val="24"/>
+          <w:szCs w:val="24"/>
+          <w:lang w:eastAsia="ru-RU"/>
+        </w:rPr>
+        <w:t xml:space="preserve"> с значением </w:t>
+      </w:r>
+      <w:proofErr w:type="spellStart"/>
+      <w:r>
+        <w:rPr>
+          <w:rFonts w:eastAsia="Times New Roman" w:cstheme="minorHAnsi"/>
+          <w:sz w:val="24"/>
+          <w:szCs w:val="24"/>
+          <w:lang w:eastAsia="ru-RU"/>
+        </w:rPr>
+        <w:t>color</w:t>
+      </w:r>
+      <w:proofErr w:type="spellEnd"/>
+      <w:r>
+        <w:rPr>
+          <w:rFonts w:eastAsia="Times New Roman" w:cstheme="minorHAnsi"/>
+          <w:sz w:val="24"/>
+          <w:szCs w:val="24"/>
+          <w:lang w:eastAsia="ru-RU"/>
+        </w:rPr>
+        <w:t>=0 (черный цвет) есть всего 4 варианта позиций (</w:t>
+      </w:r>
+      <w:proofErr w:type="spellStart"/>
+      <w:r>
+        <w:rPr>
+          <w:rFonts w:eastAsia="Times New Roman" w:cstheme="minorHAnsi"/>
+          <w:sz w:val="24"/>
+          <w:szCs w:val="24"/>
+          <w:lang w:eastAsia="ru-RU"/>
+        </w:rPr>
+        <w:t>position</w:t>
+      </w:r>
+      <w:proofErr w:type="spellEnd"/>
+      <w:r>
+        <w:rPr>
+          <w:rFonts w:eastAsia="Times New Roman" w:cstheme="minorHAnsi"/>
+          <w:sz w:val="24"/>
+          <w:szCs w:val="24"/>
+          <w:lang w:eastAsia="ru-RU"/>
+        </w:rPr>
+        <w:t xml:space="preserve">) - значения 0, 1, 2 и 3; у тех, что со значением </w:t>
+      </w:r>
+      <w:proofErr w:type="spellStart"/>
+      <w:r>
+        <w:rPr>
+          <w:rFonts w:eastAsia="Times New Roman" w:cstheme="minorHAnsi"/>
+          <w:sz w:val="24"/>
+          <w:szCs w:val="24"/>
+          <w:lang w:eastAsia="ru-RU"/>
+        </w:rPr>
+        <w:t>color</w:t>
+      </w:r>
+      <w:proofErr w:type="spellEnd"/>
+      <w:r>
+        <w:rPr>
+          <w:rFonts w:eastAsia="Times New Roman" w:cstheme="minorHAnsi"/>
+          <w:sz w:val="24"/>
+          <w:szCs w:val="24"/>
+          <w:lang w:eastAsia="ru-RU"/>
+        </w:rPr>
+        <w:t xml:space="preserve">=1 (белые) позиции 0, 1, 2, 3, 4, 5, 6, 7, 8, 9, 10, 11. Мне нужно пройтись по следующему алгоритму с несколькими условиями, упрощающими мой перебор и найти существует ли решение </w:t>
       </w:r>
       <w:r>
         <w:rPr>
@@ -37,16 +284,7 @@
           <w:szCs w:val="24"/>
           <w:lang w:eastAsia="ru-RU"/>
         </w:rPr>
-        <w:t>.</w:t>
-      </w:r>
-      <w:r>
-        <w:rPr>
-          <w:rFonts w:eastAsia="Times New Roman" w:cstheme="minorHAnsi"/>
-          <w:sz w:val="24"/>
-          <w:szCs w:val="24"/>
-          <w:lang w:eastAsia="ru-RU"/>
-        </w:rPr>
-        <w:t xml:space="preserve"> При провале я возвращаю объект </w:t>
+        <w:t xml:space="preserve">. При провале я возвращаю объект </w:t>
       </w:r>
       <w:r>
         <w:rPr>
@@ -136,16 +374,7 @@
           <w:szCs w:val="24"/>
           <w:lang w:eastAsia="ru-RU"/>
         </w:rPr>
-        <w:t xml:space="preserve"> –</w:t>
-      </w:r>
-      <w:r>
-        <w:rPr>
-          <w:rFonts w:eastAsia="Times New Roman" w:cstheme="minorHAnsi"/>
-          <w:sz w:val="24"/>
-          <w:szCs w:val="24"/>
-          <w:lang w:eastAsia="ru-RU"/>
-        </w:rPr>
-        <w:t xml:space="preserve"> объект с атрибутами х, у, </w:t>
+        <w:t xml:space="preserve"> – объект с атрибутами х, у, </w:t>
       </w:r>
       <w:r>
         <w:rPr>
@@ -192,6 +421,7 @@
         </w:rPr>
         <w:t xml:space="preserve"> Соответственно, при успешном нахождении решения возвращается </w:t>
       </w:r>
+      <w:proofErr w:type="gramStart"/>
       <w:r>
         <w:rPr>
           <w:rFonts w:eastAsia="Times New Roman" w:cstheme="minorHAnsi"/>
@@ -210,6 +440,7 @@
         </w:rPr>
         <w:t>(</w:t>
       </w:r>
+      <w:proofErr w:type="gramEnd"/>
       <w:r>
         <w:rPr>
           <w:rFonts w:eastAsia="Times New Roman" w:cstheme="minorHAnsi"/>
@@ -226,16 +457,7 @@
           <w:szCs w:val="24"/>
           <w:lang w:eastAsia="ru-RU"/>
         </w:rPr>
-        <w:t xml:space="preserve">, </w:t>
-      </w:r>
-      <w:r>
-        <w:rPr>
-          <w:rFonts w:eastAsia="Times New Roman" w:cstheme="minorHAnsi"/>
-          <w:sz w:val="24"/>
-          <w:szCs w:val="24"/>
-          <w:lang w:eastAsia="ru-RU"/>
-        </w:rPr>
-        <w:t xml:space="preserve">список </w:t>
+        <w:t xml:space="preserve">, список </w:t>
       </w:r>
       <w:r>
         <w:rPr>
@@ -253,16 +475,7 @@
           <w:szCs w:val="24"/>
           <w:lang w:eastAsia="ru-RU"/>
         </w:rPr>
-        <w:t xml:space="preserve">, </w:t>
-      </w:r>
-      <w:r>
-        <w:rPr>
-          <w:rFonts w:eastAsia="Times New Roman" w:cstheme="minorHAnsi"/>
-          <w:sz w:val="24"/>
-          <w:szCs w:val="24"/>
-          <w:lang w:eastAsia="ru-RU"/>
-        </w:rPr>
-        <w:t xml:space="preserve">список получившихся </w:t>
+        <w:t xml:space="preserve">, список получившихся </w:t>
       </w:r>
       <w:r>
         <w:rPr>
@@ -300,7 +513,27 @@
           <w:szCs w:val="24"/>
           <w:lang w:eastAsia="ru-RU"/>
         </w:rPr>
-        <w:t xml:space="preserve">1. Сразу отметаются те комбинации, где Pipe упирается в границу, это запретные: для черных: </w:t>
+        <w:t xml:space="preserve">1. Сразу отметаются те комбинации, где </w:t>
+      </w:r>
+      <w:proofErr w:type="spellStart"/>
+      <w:r>
+        <w:rPr>
+          <w:rFonts w:eastAsia="Times New Roman" w:cstheme="minorHAnsi"/>
+          <w:sz w:val="24"/>
+          <w:szCs w:val="24"/>
+          <w:lang w:eastAsia="ru-RU"/>
+        </w:rPr>
+        <w:t>Pipe</w:t>
+      </w:r>
+      <w:proofErr w:type="spellEnd"/>
+      <w:r>
+        <w:rPr>
+          <w:rFonts w:eastAsia="Times New Roman" w:cstheme="minorHAnsi"/>
+          <w:sz w:val="24"/>
+          <w:szCs w:val="24"/>
+          <w:lang w:eastAsia="ru-RU"/>
+        </w:rPr>
+        <w:t xml:space="preserve"> упирается в границу, это запретные: для черных: </w:t>
       </w:r>
       <w:r>
         <w:rPr>
@@ -408,7 +641,27 @@
           <w:szCs w:val="24"/>
           <w:lang w:eastAsia="ru-RU"/>
         </w:rPr>
-        <w:t xml:space="preserve">х=length - позиции=0, 2, 5, 6, 7, 8, 9, 10, 11; </w:t>
+        <w:t>х=</w:t>
+      </w:r>
+      <w:proofErr w:type="spellStart"/>
+      <w:r>
+        <w:rPr>
+          <w:rFonts w:eastAsia="Times New Roman" w:cstheme="minorHAnsi"/>
+          <w:sz w:val="24"/>
+          <w:szCs w:val="24"/>
+          <w:lang w:eastAsia="ru-RU"/>
+        </w:rPr>
+        <w:t>length</w:t>
+      </w:r>
+      <w:proofErr w:type="spellEnd"/>
+      <w:r>
+        <w:rPr>
+          <w:rFonts w:eastAsia="Times New Roman" w:cstheme="minorHAnsi"/>
+          <w:sz w:val="24"/>
+          <w:szCs w:val="24"/>
+          <w:lang w:eastAsia="ru-RU"/>
+        </w:rPr>
+        <w:t xml:space="preserve"> - позиции=0, 2, 5, 6, 7, 8, 9, 10, 11; </w:t>
       </w:r>
       <w:r>
         <w:rPr>
@@ -444,7 +697,27 @@
           <w:szCs w:val="24"/>
           <w:lang w:eastAsia="ru-RU"/>
         </w:rPr>
-        <w:t xml:space="preserve">у=width - позиции=0, 1, 2, 3, 4, 5, 6, 8, 10. </w:t>
+        <w:t>у=</w:t>
+      </w:r>
+      <w:proofErr w:type="spellStart"/>
+      <w:r>
+        <w:rPr>
+          <w:rFonts w:eastAsia="Times New Roman" w:cstheme="minorHAnsi"/>
+          <w:sz w:val="24"/>
+          <w:szCs w:val="24"/>
+          <w:lang w:eastAsia="ru-RU"/>
+        </w:rPr>
+        <w:t>width</w:t>
+      </w:r>
+      <w:proofErr w:type="spellEnd"/>
+      <w:r>
+        <w:rPr>
+          <w:rFonts w:eastAsia="Times New Roman" w:cstheme="minorHAnsi"/>
+          <w:sz w:val="24"/>
+          <w:szCs w:val="24"/>
+          <w:lang w:eastAsia="ru-RU"/>
+        </w:rPr>
+        <w:t xml:space="preserve"> - позиции=0, 1, 2, 3, 4, 5, 6, 8, 10. </w:t>
       </w:r>
       <w:r>
         <w:rPr>
@@ -527,6 +800,15 @@
           <w:szCs w:val="24"/>
           <w:lang w:eastAsia="ru-RU"/>
         </w:rPr>
+        <w:t xml:space="preserve">Изначально вся матрица заполнена значением -1, что означает, что ячейка матрицы не была «обработана». </w:t>
+      </w:r>
+      <w:r>
+        <w:rPr>
+          <w:rFonts w:eastAsia="Times New Roman" w:cstheme="minorHAnsi"/>
+          <w:sz w:val="24"/>
+          <w:szCs w:val="24"/>
+          <w:lang w:eastAsia="ru-RU"/>
+        </w:rPr>
         <w:t>Далее необходимо преобразовать каждую</w:t>
       </w:r>
       <w:r>
@@ -536,7 +818,27 @@
           <w:szCs w:val="24"/>
           <w:lang w:eastAsia="ru-RU"/>
         </w:rPr>
-        <w:t xml:space="preserve"> Pipe в </w:t>
+        <w:t xml:space="preserve"> </w:t>
+      </w:r>
+      <w:proofErr w:type="spellStart"/>
+      <w:r>
+        <w:rPr>
+          <w:rFonts w:eastAsia="Times New Roman" w:cstheme="minorHAnsi"/>
+          <w:sz w:val="24"/>
+          <w:szCs w:val="24"/>
+          <w:lang w:eastAsia="ru-RU"/>
+        </w:rPr>
+        <w:t>Pipe</w:t>
+      </w:r>
+      <w:proofErr w:type="spellEnd"/>
+      <w:r>
+        <w:rPr>
+          <w:rFonts w:eastAsia="Times New Roman" w:cstheme="minorHAnsi"/>
+          <w:sz w:val="24"/>
+          <w:szCs w:val="24"/>
+          <w:lang w:eastAsia="ru-RU"/>
+        </w:rPr>
+        <w:t xml:space="preserve"> в </w:t>
       </w:r>
       <w:r>
         <w:rPr>
@@ -554,25 +856,27 @@
           <w:szCs w:val="24"/>
           <w:lang w:eastAsia="ru-RU"/>
         </w:rPr>
-        <w:t xml:space="preserve"> для дальнейшей работы</w:t>
-      </w:r>
-      <w:r>
-        <w:rPr>
-          <w:rFonts w:eastAsia="Times New Roman" w:cstheme="minorHAnsi"/>
-          <w:sz w:val="24"/>
-          <w:szCs w:val="24"/>
-          <w:lang w:eastAsia="ru-RU"/>
-        </w:rPr>
-        <w:t xml:space="preserve"> с матрицей</w:t>
-      </w:r>
-      <w:r>
-        <w:rPr>
-          <w:rFonts w:eastAsia="Times New Roman" w:cstheme="minorHAnsi"/>
-          <w:sz w:val="24"/>
-          <w:szCs w:val="24"/>
-          <w:lang w:eastAsia="ru-RU"/>
-        </w:rPr>
-        <w:t xml:space="preserve">, каждая Pipe </w:t>
+        <w:t xml:space="preserve">, каждая </w:t>
+      </w:r>
+      <w:proofErr w:type="spellStart"/>
+      <w:r>
+        <w:rPr>
+          <w:rFonts w:eastAsia="Times New Roman" w:cstheme="minorHAnsi"/>
+          <w:sz w:val="24"/>
+          <w:szCs w:val="24"/>
+          <w:lang w:eastAsia="ru-RU"/>
+        </w:rPr>
+        <w:t>Pipe</w:t>
+      </w:r>
+      <w:proofErr w:type="spellEnd"/>
+      <w:r>
+        <w:rPr>
+          <w:rFonts w:eastAsia="Times New Roman" w:cstheme="minorHAnsi"/>
+          <w:sz w:val="24"/>
+          <w:szCs w:val="24"/>
+          <w:lang w:eastAsia="ru-RU"/>
+        </w:rPr>
+        <w:t xml:space="preserve"> </w:t>
       </w:r>
       <w:r>
         <w:rPr>
@@ -601,7 +905,87 @@
           <w:szCs w:val="24"/>
           <w:lang w:eastAsia="ru-RU"/>
         </w:rPr>
-        <w:t xml:space="preserve">для черных: 0=(x,y)=5, (x,y-1)=1, (x-1,y)=2; 1=(x-1,y)=2, (x,y)=4, (x,y+1)=1; 2=(x,y)=3, (x,y+1)=1, (x+1,y)=2; 3=(x,y-1)=1, (x,y)=6, (x+1,y)=2; </w:t>
+        <w:t>для черных: 0=(</w:t>
+      </w:r>
+      <w:proofErr w:type="spellStart"/>
+      <w:r>
+        <w:rPr>
+          <w:rFonts w:eastAsia="Times New Roman" w:cstheme="minorHAnsi"/>
+          <w:sz w:val="24"/>
+          <w:szCs w:val="24"/>
+          <w:lang w:eastAsia="ru-RU"/>
+        </w:rPr>
+        <w:t>x,y</w:t>
+      </w:r>
+      <w:proofErr w:type="spellEnd"/>
+      <w:r>
+        <w:rPr>
+          <w:rFonts w:eastAsia="Times New Roman" w:cstheme="minorHAnsi"/>
+          <w:sz w:val="24"/>
+          <w:szCs w:val="24"/>
+          <w:lang w:eastAsia="ru-RU"/>
+        </w:rPr>
+        <w:t>)=5, (x,y-1)=1, (x-1,y)=2; 1=(x-1,y)=2, (</w:t>
+      </w:r>
+      <w:proofErr w:type="spellStart"/>
+      <w:r>
+        <w:rPr>
+          <w:rFonts w:eastAsia="Times New Roman" w:cstheme="minorHAnsi"/>
+          <w:sz w:val="24"/>
+          <w:szCs w:val="24"/>
+          <w:lang w:eastAsia="ru-RU"/>
+        </w:rPr>
+        <w:t>x,y</w:t>
+      </w:r>
+      <w:proofErr w:type="spellEnd"/>
+      <w:r>
+        <w:rPr>
+          <w:rFonts w:eastAsia="Times New Roman" w:cstheme="minorHAnsi"/>
+          <w:sz w:val="24"/>
+          <w:szCs w:val="24"/>
+          <w:lang w:eastAsia="ru-RU"/>
+        </w:rPr>
+        <w:t>)=4, (x,y+1)=1; 2=(</w:t>
+      </w:r>
+      <w:proofErr w:type="spellStart"/>
+      <w:r>
+        <w:rPr>
+          <w:rFonts w:eastAsia="Times New Roman" w:cstheme="minorHAnsi"/>
+          <w:sz w:val="24"/>
+          <w:szCs w:val="24"/>
+          <w:lang w:eastAsia="ru-RU"/>
+        </w:rPr>
+        <w:t>x,y</w:t>
+      </w:r>
+      <w:proofErr w:type="spellEnd"/>
+      <w:r>
+        <w:rPr>
+          <w:rFonts w:eastAsia="Times New Roman" w:cstheme="minorHAnsi"/>
+          <w:sz w:val="24"/>
+          <w:szCs w:val="24"/>
+          <w:lang w:eastAsia="ru-RU"/>
+        </w:rPr>
+        <w:t>)=3, (x,y+1)=1, (x+1,y)=2; 3=(x,y-1)=1, (</w:t>
+      </w:r>
+      <w:proofErr w:type="spellStart"/>
+      <w:r>
+        <w:rPr>
+          <w:rFonts w:eastAsia="Times New Roman" w:cstheme="minorHAnsi"/>
+          <w:sz w:val="24"/>
+          <w:szCs w:val="24"/>
+          <w:lang w:eastAsia="ru-RU"/>
+        </w:rPr>
+        <w:t>x,y</w:t>
+      </w:r>
+      <w:proofErr w:type="spellEnd"/>
+      <w:r>
+        <w:rPr>
+          <w:rFonts w:eastAsia="Times New Roman" w:cstheme="minorHAnsi"/>
+          <w:sz w:val="24"/>
+          <w:szCs w:val="24"/>
+          <w:lang w:eastAsia="ru-RU"/>
+        </w:rPr>
+        <w:t xml:space="preserve">)=6, (x+1,y)=2; </w:t>
       </w:r>
     </w:p>
     <w:p>
@@ -621,7 +1005,247 @@
           <w:szCs w:val="24"/>
           <w:lang w:eastAsia="ru-RU"/>
         </w:rPr>
-        <w:t xml:space="preserve">для белых: 0=(x,y-1)=1, (x,y)=1, (x,y+1)=6; 1=(x,y-1)=1, (x,y)=1, (x,y+1)=5; 2=(x,y-1)=3, (x,y)=1, (x,y+1)=1; 3=(x,y-1)=4, (x,y)=1, (x,y+1)=1; 4=(x,y-1)=4, (x,y)=1, (x,y+1)=5; 5=(x,y-1)=3, (x,y)=1, (x,y+1)=6; 6=(x-1,y)=3, (x,y)=2, (x+1,y)=2; 7=(x-1,y)=6, (x,y)=2, (x+1,y)=2; 8=(x-1,y)=2, (x,y)=2, (x+1,y)=4; 9=(x-1,y)=2, (x,y)=2, (x+1,y)=5; 10=(x-1,y)=3, (x,y)=2, (x+1,y)=4; 11=(x-1,y)=6, (x,y)=2, (x+1,y)=5. </w:t>
+        <w:t>для белых: 0=(x,y-1)=1, (</w:t>
+      </w:r>
+      <w:proofErr w:type="spellStart"/>
+      <w:r>
+        <w:rPr>
+          <w:rFonts w:eastAsia="Times New Roman" w:cstheme="minorHAnsi"/>
+          <w:sz w:val="24"/>
+          <w:szCs w:val="24"/>
+          <w:lang w:eastAsia="ru-RU"/>
+        </w:rPr>
+        <w:t>x,y</w:t>
+      </w:r>
+      <w:proofErr w:type="spellEnd"/>
+      <w:r>
+        <w:rPr>
+          <w:rFonts w:eastAsia="Times New Roman" w:cstheme="minorHAnsi"/>
+          <w:sz w:val="24"/>
+          <w:szCs w:val="24"/>
+          <w:lang w:eastAsia="ru-RU"/>
+        </w:rPr>
+        <w:t>)=1, (x,y+1)=6; 1=(x,y-1)=1, (</w:t>
+      </w:r>
+      <w:proofErr w:type="spellStart"/>
+      <w:r>
+        <w:rPr>
+          <w:rFonts w:eastAsia="Times New Roman" w:cstheme="minorHAnsi"/>
+          <w:sz w:val="24"/>
+          <w:szCs w:val="24"/>
+          <w:lang w:eastAsia="ru-RU"/>
+        </w:rPr>
+        <w:t>x,y</w:t>
+      </w:r>
+      <w:proofErr w:type="spellEnd"/>
+      <w:r>
+        <w:rPr>
+          <w:rFonts w:eastAsia="Times New Roman" w:cstheme="minorHAnsi"/>
+          <w:sz w:val="24"/>
+          <w:szCs w:val="24"/>
+          <w:lang w:eastAsia="ru-RU"/>
+        </w:rPr>
+        <w:t>)=1, (x,y+1)=5; 2=(x,y-1)=3, (</w:t>
+      </w:r>
+      <w:proofErr w:type="spellStart"/>
+      <w:r>
+        <w:rPr>
+          <w:rFonts w:eastAsia="Times New Roman" w:cstheme="minorHAnsi"/>
+          <w:sz w:val="24"/>
+          <w:szCs w:val="24"/>
+          <w:lang w:eastAsia="ru-RU"/>
+        </w:rPr>
+        <w:t>x,y</w:t>
+      </w:r>
+      <w:proofErr w:type="spellEnd"/>
+      <w:r>
+        <w:rPr>
+          <w:rFonts w:eastAsia="Times New Roman" w:cstheme="minorHAnsi"/>
+          <w:sz w:val="24"/>
+          <w:szCs w:val="24"/>
+          <w:lang w:eastAsia="ru-RU"/>
+        </w:rPr>
+        <w:t>)=1, (x,y+1)=1; 3=(x,y-1)=4, (</w:t>
+      </w:r>
+      <w:proofErr w:type="spellStart"/>
+      <w:r>
+        <w:rPr>
+          <w:rFonts w:eastAsia="Times New Roman" w:cstheme="minorHAnsi"/>
+          <w:sz w:val="24"/>
+          <w:szCs w:val="24"/>
+          <w:lang w:eastAsia="ru-RU"/>
+        </w:rPr>
+        <w:t>x,y</w:t>
+      </w:r>
+      <w:proofErr w:type="spellEnd"/>
+      <w:r>
+        <w:rPr>
+          <w:rFonts w:eastAsia="Times New Roman" w:cstheme="minorHAnsi"/>
+          <w:sz w:val="24"/>
+          <w:szCs w:val="24"/>
+          <w:lang w:eastAsia="ru-RU"/>
+        </w:rPr>
+        <w:t>)=1, (x,y+1)=1; 4=(x,y-1)=4, (</w:t>
+      </w:r>
+      <w:proofErr w:type="spellStart"/>
+      <w:r>
+        <w:rPr>
+          <w:rFonts w:eastAsia="Times New Roman" w:cstheme="minorHAnsi"/>
+          <w:sz w:val="24"/>
+          <w:szCs w:val="24"/>
+          <w:lang w:eastAsia="ru-RU"/>
+        </w:rPr>
+        <w:t>x,y</w:t>
+      </w:r>
+      <w:proofErr w:type="spellEnd"/>
+      <w:r>
+        <w:rPr>
+          <w:rFonts w:eastAsia="Times New Roman" w:cstheme="minorHAnsi"/>
+          <w:sz w:val="24"/>
+          <w:szCs w:val="24"/>
+          <w:lang w:eastAsia="ru-RU"/>
+        </w:rPr>
+        <w:t>)=1, (x,y+1)=5; 5=(x,y-1)=3, (</w:t>
+      </w:r>
+      <w:proofErr w:type="spellStart"/>
+      <w:r>
+        <w:rPr>
+          <w:rFonts w:eastAsia="Times New Roman" w:cstheme="minorHAnsi"/>
+          <w:sz w:val="24"/>
+          <w:szCs w:val="24"/>
+          <w:lang w:eastAsia="ru-RU"/>
+        </w:rPr>
+        <w:t>x,y</w:t>
+      </w:r>
+      <w:proofErr w:type="spellEnd"/>
+      <w:r>
+        <w:rPr>
+          <w:rFonts w:eastAsia="Times New Roman" w:cstheme="minorHAnsi"/>
+          <w:sz w:val="24"/>
+          <w:szCs w:val="24"/>
+          <w:lang w:eastAsia="ru-RU"/>
+        </w:rPr>
+        <w:t>)=1, (x,y+1)=6; 6=(x-1,y)=3, (</w:t>
+      </w:r>
+      <w:proofErr w:type="spellStart"/>
+      <w:r>
+        <w:rPr>
+          <w:rFonts w:eastAsia="Times New Roman" w:cstheme="minorHAnsi"/>
+          <w:sz w:val="24"/>
+          <w:szCs w:val="24"/>
+          <w:lang w:eastAsia="ru-RU"/>
+        </w:rPr>
+        <w:t>x,y</w:t>
+      </w:r>
+      <w:proofErr w:type="spellEnd"/>
+      <w:r>
+        <w:rPr>
+          <w:rFonts w:eastAsia="Times New Roman" w:cstheme="minorHAnsi"/>
+          <w:sz w:val="24"/>
+          <w:szCs w:val="24"/>
+          <w:lang w:eastAsia="ru-RU"/>
+        </w:rPr>
+        <w:t>)=2, (x+1,y)=2; 7=(x-1,y)=6, (</w:t>
+      </w:r>
+      <w:proofErr w:type="spellStart"/>
+      <w:r>
+        <w:rPr>
+          <w:rFonts w:eastAsia="Times New Roman" w:cstheme="minorHAnsi"/>
+          <w:sz w:val="24"/>
+          <w:szCs w:val="24"/>
+          <w:lang w:eastAsia="ru-RU"/>
+        </w:rPr>
+        <w:t>x,y</w:t>
+      </w:r>
+      <w:proofErr w:type="spellEnd"/>
+      <w:r>
+        <w:rPr>
+          <w:rFonts w:eastAsia="Times New Roman" w:cstheme="minorHAnsi"/>
+          <w:sz w:val="24"/>
+          <w:szCs w:val="24"/>
+          <w:lang w:eastAsia="ru-RU"/>
+        </w:rPr>
+        <w:t>)=2, (x+1,y)=2; 8=(x-1,y)=2, (</w:t>
+      </w:r>
+      <w:proofErr w:type="spellStart"/>
+      <w:r>
+        <w:rPr>
+          <w:rFonts w:eastAsia="Times New Roman" w:cstheme="minorHAnsi"/>
+          <w:sz w:val="24"/>
+          <w:szCs w:val="24"/>
+          <w:lang w:eastAsia="ru-RU"/>
+        </w:rPr>
+        <w:t>x,y</w:t>
+      </w:r>
+      <w:proofErr w:type="spellEnd"/>
+      <w:r>
+        <w:rPr>
+          <w:rFonts w:eastAsia="Times New Roman" w:cstheme="minorHAnsi"/>
+          <w:sz w:val="24"/>
+          <w:szCs w:val="24"/>
+          <w:lang w:eastAsia="ru-RU"/>
+        </w:rPr>
+        <w:t>)=2, (x+1,y)=4; 9=(x-1,y)=2, (</w:t>
+      </w:r>
+      <w:proofErr w:type="spellStart"/>
+      <w:r>
+        <w:rPr>
+          <w:rFonts w:eastAsia="Times New Roman" w:cstheme="minorHAnsi"/>
+          <w:sz w:val="24"/>
+          <w:szCs w:val="24"/>
+          <w:lang w:eastAsia="ru-RU"/>
+        </w:rPr>
+        <w:t>x,y</w:t>
+      </w:r>
+      <w:proofErr w:type="spellEnd"/>
+      <w:r>
+        <w:rPr>
+          <w:rFonts w:eastAsia="Times New Roman" w:cstheme="minorHAnsi"/>
+          <w:sz w:val="24"/>
+          <w:szCs w:val="24"/>
+          <w:lang w:eastAsia="ru-RU"/>
+        </w:rPr>
+        <w:t>)=2, (x+1,y)=5; 10=(x-1,y)=3, (</w:t>
+      </w:r>
+      <w:proofErr w:type="spellStart"/>
+      <w:r>
+        <w:rPr>
+          <w:rFonts w:eastAsia="Times New Roman" w:cstheme="minorHAnsi"/>
+          <w:sz w:val="24"/>
+          <w:szCs w:val="24"/>
+          <w:lang w:eastAsia="ru-RU"/>
+        </w:rPr>
+        <w:t>x,y</w:t>
+      </w:r>
+      <w:proofErr w:type="spellEnd"/>
+      <w:r>
+        <w:rPr>
+          <w:rFonts w:eastAsia="Times New Roman" w:cstheme="minorHAnsi"/>
+          <w:sz w:val="24"/>
+          <w:szCs w:val="24"/>
+          <w:lang w:eastAsia="ru-RU"/>
+        </w:rPr>
+        <w:t>)=2, (x+1,y)=4; 11=(x-1,y)=6, (</w:t>
+      </w:r>
+      <w:proofErr w:type="spellStart"/>
+      <w:r>
+        <w:rPr>
+          <w:rFonts w:eastAsia="Times New Roman" w:cstheme="minorHAnsi"/>
+          <w:sz w:val="24"/>
+          <w:szCs w:val="24"/>
+          <w:lang w:eastAsia="ru-RU"/>
+        </w:rPr>
+        <w:t>x,y</w:t>
+      </w:r>
+      <w:proofErr w:type="spellEnd"/>
+      <w:r>
+        <w:rPr>
+          <w:rFonts w:eastAsia="Times New Roman" w:cstheme="minorHAnsi"/>
+          <w:sz w:val="24"/>
+          <w:szCs w:val="24"/>
+          <w:lang w:eastAsia="ru-RU"/>
+        </w:rPr>
+        <w:t xml:space="preserve">)=2, (x+1,y)=5. </w:t>
       </w:r>
     </w:p>
     <w:p>
@@ -704,16 +1328,36 @@
           <w:szCs w:val="24"/>
           <w:lang w:eastAsia="ru-RU"/>
         </w:rPr>
-        <w:t xml:space="preserve"> (</w:t>
-      </w:r>
-      <w:r>
-        <w:rPr>
-          <w:rFonts w:eastAsia="Times New Roman" w:cstheme="minorHAnsi"/>
-          <w:sz w:val="24"/>
-          <w:szCs w:val="24"/>
-          <w:lang w:eastAsia="ru-RU"/>
-        </w:rPr>
-        <w:t>то есть в ячейке не 0)</w:t>
+        <w:t xml:space="preserve"> (то есть в </w:t>
+      </w:r>
+      <w:proofErr w:type="gramStart"/>
+      <w:r>
+        <w:rPr>
+          <w:rFonts w:eastAsia="Times New Roman" w:cstheme="minorHAnsi"/>
+          <w:sz w:val="24"/>
+          <w:szCs w:val="24"/>
+          <w:lang w:eastAsia="ru-RU"/>
+        </w:rPr>
+        <w:t xml:space="preserve">ячейке </w:t>
+      </w:r>
+      <w:r>
+        <w:rPr>
+          <w:rFonts w:eastAsia="Times New Roman" w:cstheme="minorHAnsi"/>
+          <w:sz w:val="24"/>
+          <w:szCs w:val="24"/>
+          <w:lang w:eastAsia="ru-RU"/>
+        </w:rPr>
+        <w:t>&gt;</w:t>
+      </w:r>
+      <w:proofErr w:type="gramEnd"/>
+      <w:r>
+        <w:rPr>
+          <w:rFonts w:eastAsia="Times New Roman" w:cstheme="minorHAnsi"/>
+          <w:sz w:val="24"/>
+          <w:szCs w:val="24"/>
+          <w:lang w:eastAsia="ru-RU"/>
+        </w:rPr>
+        <w:t xml:space="preserve"> 0)</w:t>
       </w:r>
       <w:r>
         <w:rPr>
@@ -767,7 +1411,27 @@
           <w:szCs w:val="24"/>
           <w:lang w:eastAsia="ru-RU"/>
         </w:rPr>
-        <w:t xml:space="preserve">), то такой вариант мы тоже сразу записываем с результатом false. Допустимые сочетания слева-направо, сверху-вниз: </w:t>
+        <w:t xml:space="preserve">), то такой вариант мы тоже сразу записываем с результатом </w:t>
+      </w:r>
+      <w:proofErr w:type="spellStart"/>
+      <w:r>
+        <w:rPr>
+          <w:rFonts w:eastAsia="Times New Roman" w:cstheme="minorHAnsi"/>
+          <w:sz w:val="24"/>
+          <w:szCs w:val="24"/>
+          <w:lang w:eastAsia="ru-RU"/>
+        </w:rPr>
+        <w:t>false</w:t>
+      </w:r>
+      <w:proofErr w:type="spellEnd"/>
+      <w:r>
+        <w:rPr>
+          <w:rFonts w:eastAsia="Times New Roman" w:cstheme="minorHAnsi"/>
+          <w:sz w:val="24"/>
+          <w:szCs w:val="24"/>
+          <w:lang w:eastAsia="ru-RU"/>
+        </w:rPr>
+        <w:t xml:space="preserve">. </w:t>
       </w:r>
     </w:p>
     <w:p>
@@ -787,25 +1451,7 @@
           <w:szCs w:val="24"/>
           <w:lang w:eastAsia="ru-RU"/>
         </w:rPr>
-        <w:t xml:space="preserve">по горизонтали (проверка у и у+1): </w:t>
-      </w:r>
-      <w:r>
-        <w:rPr>
-          <w:rFonts w:eastAsia="Times New Roman" w:cstheme="minorHAnsi"/>
-          <w:sz w:val="24"/>
-          <w:szCs w:val="24"/>
-          <w:lang w:eastAsia="ru-RU"/>
-        </w:rPr>
-        <w:t xml:space="preserve">0=0, 2, 3, 4; </w:t>
-      </w:r>
-      <w:r>
-        <w:rPr>
-          <w:rFonts w:eastAsia="Times New Roman" w:cstheme="minorHAnsi"/>
-          <w:sz w:val="24"/>
-          <w:szCs w:val="24"/>
-          <w:lang w:eastAsia="ru-RU"/>
-        </w:rPr>
-        <w:t xml:space="preserve">1=1, 5, 6; 2=0, 2, 3, 4; 3=1, 5, 6; 4=1, 5, 6; 5=0, 2, 3, 4; 6=0, 2, 3, 4; </w:t>
+        <w:t xml:space="preserve">Допустимые сочетания слева-направо, сверху-вниз: </w:t>
       </w:r>
     </w:p>
     <w:p>
@@ -825,25 +1471,25 @@
           <w:szCs w:val="24"/>
           <w:lang w:eastAsia="ru-RU"/>
         </w:rPr>
-        <w:t xml:space="preserve">по вертикали (проверка х и х+1): </w:t>
-      </w:r>
-      <w:r>
-        <w:rPr>
-          <w:rFonts w:eastAsia="Times New Roman" w:cstheme="minorHAnsi"/>
-          <w:sz w:val="24"/>
-          <w:szCs w:val="24"/>
-          <w:lang w:eastAsia="ru-RU"/>
-        </w:rPr>
-        <w:t xml:space="preserve">0=0, 1, 3, 6; </w:t>
-      </w:r>
-      <w:r>
-        <w:rPr>
-          <w:rFonts w:eastAsia="Times New Roman" w:cstheme="minorHAnsi"/>
-          <w:sz w:val="24"/>
-          <w:szCs w:val="24"/>
-          <w:lang w:eastAsia="ru-RU"/>
-        </w:rPr>
-        <w:t xml:space="preserve">1=0, 1, 3, 6; 2=2, 4, 5; 3=2, 4, 5; 4=0, 1, 3, 6; 5=0, 1, 3, 6; 6=2, 4, 5; </w:t>
+        <w:t xml:space="preserve">по горизонтали (проверка у и у+1): </w:t>
+      </w:r>
+      <w:r>
+        <w:rPr>
+          <w:rFonts w:eastAsia="Times New Roman" w:cstheme="minorHAnsi"/>
+          <w:sz w:val="24"/>
+          <w:szCs w:val="24"/>
+          <w:lang w:eastAsia="ru-RU"/>
+        </w:rPr>
+        <w:t xml:space="preserve">0=0, 2, 3, 4; </w:t>
+      </w:r>
+      <w:r>
+        <w:rPr>
+          <w:rFonts w:eastAsia="Times New Roman" w:cstheme="minorHAnsi"/>
+          <w:sz w:val="24"/>
+          <w:szCs w:val="24"/>
+          <w:lang w:eastAsia="ru-RU"/>
+        </w:rPr>
+        <w:t xml:space="preserve">1=1, 5, 6; 2=0, 2, 3, 4; 3=1, 5, 6; 4=1, 5, 6; 5=0, 2, 3, 4; 6=0, 2, 3, 4; </w:t>
       </w:r>
     </w:p>
     <w:p>
@@ -863,115 +1509,25 @@
           <w:szCs w:val="24"/>
           <w:lang w:eastAsia="ru-RU"/>
         </w:rPr>
-        <w:t>4. Теперь мы перебираем для каждой из оставшихся пустых (в которых не стояли изначально трубы) клеток матрицы width х length значения от 0 до 6</w:t>
-      </w:r>
-      <w:r>
-        <w:rPr>
-          <w:rFonts w:eastAsia="Times New Roman" w:cstheme="minorHAnsi"/>
-          <w:sz w:val="24"/>
-          <w:szCs w:val="24"/>
-          <w:lang w:eastAsia="ru-RU"/>
-        </w:rPr>
-        <w:t xml:space="preserve">. Соответственно, у нас должно получиться </w:t>
-      </w:r>
-      <w:r>
-        <w:rPr>
-          <w:rFonts w:eastAsia="Times New Roman" w:cstheme="minorHAnsi"/>
-          <w:sz w:val="24"/>
-          <w:szCs w:val="24"/>
-          <w:lang w:eastAsia="ru-RU"/>
-        </w:rPr>
-        <w:t>7^(</w:t>
-      </w:r>
-      <w:r>
-        <w:rPr>
-          <w:rFonts w:eastAsia="Times New Roman" w:cstheme="minorHAnsi"/>
-          <w:sz w:val="24"/>
-          <w:szCs w:val="24"/>
-          <w:lang w:val="en-US" w:eastAsia="ru-RU"/>
-        </w:rPr>
-        <w:t>width</w:t>
-      </w:r>
-      <w:r>
-        <w:rPr>
-          <w:rFonts w:eastAsia="Times New Roman" w:cstheme="minorHAnsi"/>
-          <w:sz w:val="24"/>
-          <w:szCs w:val="24"/>
-          <w:lang w:eastAsia="ru-RU"/>
-        </w:rPr>
-        <w:t>*</w:t>
-      </w:r>
-      <w:r>
-        <w:rPr>
-          <w:rFonts w:eastAsia="Times New Roman" w:cstheme="minorHAnsi"/>
-          <w:sz w:val="24"/>
-          <w:szCs w:val="24"/>
-          <w:lang w:val="en-US" w:eastAsia="ru-RU"/>
-        </w:rPr>
-        <w:t>length</w:t>
-      </w:r>
-      <w:r>
-        <w:rPr>
-          <w:rFonts w:eastAsia="Times New Roman" w:cstheme="minorHAnsi"/>
-          <w:sz w:val="24"/>
-          <w:szCs w:val="24"/>
-          <w:lang w:eastAsia="ru-RU"/>
-        </w:rPr>
-        <w:t>-</w:t>
-      </w:r>
-      <w:r>
-        <w:rPr>
-          <w:rFonts w:eastAsia="Times New Roman" w:cstheme="minorHAnsi"/>
-          <w:sz w:val="24"/>
-          <w:szCs w:val="24"/>
-          <w:lang w:val="en-US" w:eastAsia="ru-RU"/>
-        </w:rPr>
-        <w:t>allPipe</w:t>
-      </w:r>
-      <w:r>
-        <w:rPr>
-          <w:rFonts w:eastAsia="Times New Roman" w:cstheme="minorHAnsi"/>
-          <w:sz w:val="24"/>
-          <w:szCs w:val="24"/>
-          <w:lang w:eastAsia="ru-RU"/>
-        </w:rPr>
-        <w:t>.</w:t>
-      </w:r>
-      <w:r>
-        <w:rPr>
-          <w:rFonts w:eastAsia="Times New Roman" w:cstheme="minorHAnsi"/>
-          <w:sz w:val="24"/>
-          <w:szCs w:val="24"/>
-          <w:lang w:val="en-US" w:eastAsia="ru-RU"/>
-        </w:rPr>
-        <w:t>size</w:t>
-      </w:r>
-      <w:r>
-        <w:rPr>
-          <w:rFonts w:eastAsia="Times New Roman" w:cstheme="minorHAnsi"/>
-          <w:sz w:val="24"/>
-          <w:szCs w:val="24"/>
-          <w:lang w:eastAsia="ru-RU"/>
-        </w:rPr>
-        <w:t>()*3)</w:t>
-      </w:r>
-      <w:r>
-        <w:rPr>
-          <w:rFonts w:eastAsia="Times New Roman" w:cstheme="minorHAnsi"/>
-          <w:sz w:val="24"/>
-          <w:szCs w:val="24"/>
-          <w:lang w:eastAsia="ru-RU"/>
-        </w:rPr>
-        <w:t xml:space="preserve"> комбинаций. Каждую из них мы проверяем в цикле далее.</w:t>
-      </w:r>
-      <w:r>
-        <w:rPr>
-          <w:rFonts w:eastAsia="Times New Roman" w:cstheme="minorHAnsi"/>
-          <w:sz w:val="24"/>
-          <w:szCs w:val="24"/>
-          <w:lang w:eastAsia="ru-RU"/>
-        </w:rPr>
-        <w:t xml:space="preserve"> </w:t>
+        <w:t xml:space="preserve">по вертикали (проверка х и х+1): </w:t>
+      </w:r>
+      <w:r>
+        <w:rPr>
+          <w:rFonts w:eastAsia="Times New Roman" w:cstheme="minorHAnsi"/>
+          <w:sz w:val="24"/>
+          <w:szCs w:val="24"/>
+          <w:lang w:eastAsia="ru-RU"/>
+        </w:rPr>
+        <w:t xml:space="preserve">0=0, 1, 3, 6; </w:t>
+      </w:r>
+      <w:r>
+        <w:rPr>
+          <w:rFonts w:eastAsia="Times New Roman" w:cstheme="minorHAnsi"/>
+          <w:sz w:val="24"/>
+          <w:szCs w:val="24"/>
+          <w:lang w:eastAsia="ru-RU"/>
+        </w:rPr>
+        <w:t xml:space="preserve">1=0, 1, 3, 6; 2=2, 4, 5; 3=2, 4, 5; 4=0, 1, 3, 6; 5=0, 1, 3, 6; 6=2, 4, 5; </w:t>
       </w:r>
     </w:p>
     <w:p>
@@ -991,25 +1547,7 @@
           <w:szCs w:val="24"/>
           <w:lang w:eastAsia="ru-RU"/>
         </w:rPr>
-        <w:t xml:space="preserve">5. </w:t>
-      </w:r>
-      <w:r>
-        <w:rPr>
-          <w:rFonts w:eastAsia="Times New Roman" w:cstheme="minorHAnsi"/>
-          <w:sz w:val="24"/>
-          <w:szCs w:val="24"/>
-          <w:lang w:eastAsia="ru-RU"/>
-        </w:rPr>
-        <w:t>Сначала п</w:t>
-      </w:r>
-      <w:r>
-        <w:rPr>
-          <w:rFonts w:eastAsia="Times New Roman" w:cstheme="minorHAnsi"/>
-          <w:sz w:val="24"/>
-          <w:szCs w:val="24"/>
-          <w:lang w:eastAsia="ru-RU"/>
-        </w:rPr>
-        <w:t xml:space="preserve">роверяем, что в клетках, стоящих на краях матрицы, нет запретных позиций линий. Вот список запретных позиций: </w:t>
+        <w:t xml:space="preserve">Запретные позиции для граничных клеток: </w:t>
       </w:r>
     </w:p>
     <w:p>
@@ -1062,36 +1600,6 @@
           <w:lang w:eastAsia="ru-RU"/>
         </w:rPr>
       </w:pPr>
-      <w:r>
-        <w:rPr>
-          <w:rFonts w:eastAsia="Times New Roman" w:cstheme="minorHAnsi"/>
-          <w:sz w:val="24"/>
-          <w:szCs w:val="24"/>
-          <w:lang w:eastAsia="ru-RU"/>
-        </w:rPr>
-        <w:lastRenderedPageBreak/>
-        <w:t xml:space="preserve">Если такая линия была найдена, то мы должны </w:t>
-      </w:r>
-      <w:r>
-        <w:rPr>
-          <w:rFonts w:eastAsia="Times New Roman" w:cstheme="minorHAnsi"/>
-          <w:sz w:val="24"/>
-          <w:szCs w:val="24"/>
-          <w:lang w:eastAsia="ru-RU"/>
-        </w:rPr>
-        <w:t>перейти к следующей комбинации</w:t>
-      </w:r>
-      <w:bookmarkStart w:id="0" w:name="_GoBack"/>
-      <w:bookmarkEnd w:id="0"/>
-      <w:r>
-        <w:rPr>
-          <w:rFonts w:eastAsia="Times New Roman" w:cstheme="minorHAnsi"/>
-          <w:sz w:val="24"/>
-          <w:szCs w:val="24"/>
-          <w:lang w:eastAsia="ru-RU"/>
-        </w:rPr>
-        <w:t>.</w:t>
-      </w:r>
     </w:p>
     <w:p>
       <w:pPr>
@@ -1110,34 +1618,53 @@
           <w:szCs w:val="24"/>
           <w:lang w:eastAsia="ru-RU"/>
         </w:rPr>
-        <w:t xml:space="preserve">6. </w:t>
-      </w:r>
-      <w:r>
-        <w:rPr>
-          <w:rFonts w:eastAsia="Times New Roman" w:cstheme="minorHAnsi"/>
-          <w:sz w:val="24"/>
-          <w:szCs w:val="24"/>
-          <w:lang w:eastAsia="ru-RU"/>
-        </w:rPr>
-        <w:t>Если ни одна из линий не утыкается в границу запретно, далее мы</w:t>
-      </w:r>
-      <w:r>
-        <w:rPr>
-          <w:rFonts w:eastAsia="Times New Roman" w:cstheme="minorHAnsi"/>
-          <w:sz w:val="24"/>
-          <w:szCs w:val="24"/>
-          <w:lang w:eastAsia="ru-RU"/>
-        </w:rPr>
-        <w:t xml:space="preserve"> пробегаемся по всем клеткам матрицы и </w:t>
-      </w:r>
-      <w:r>
-        <w:rPr>
-          <w:rFonts w:eastAsia="Times New Roman" w:cstheme="minorHAnsi"/>
-          <w:sz w:val="24"/>
-          <w:szCs w:val="24"/>
-          <w:lang w:eastAsia="ru-RU"/>
-        </w:rPr>
-        <w:t>проверяем, что справа и снизу текущей линии стоят такие линии, что могут быть соединены с ней и образовать в дальнейшем одну сплошную ломаную линию (разрешенные позиции брать из списка из пункта 3)</w:t>
+        <w:lastRenderedPageBreak/>
+        <w:t xml:space="preserve">4. </w:t>
+      </w:r>
+      <w:r>
+        <w:rPr>
+          <w:rFonts w:eastAsia="Times New Roman" w:cstheme="minorHAnsi"/>
+          <w:sz w:val="24"/>
+          <w:szCs w:val="24"/>
+          <w:lang w:eastAsia="ru-RU"/>
+        </w:rPr>
+        <w:t>Далее на</w:t>
+      </w:r>
+      <w:r>
+        <w:rPr>
+          <w:rFonts w:eastAsia="Times New Roman" w:cstheme="minorHAnsi"/>
+          <w:sz w:val="24"/>
+          <w:szCs w:val="24"/>
+          <w:lang w:eastAsia="ru-RU"/>
+        </w:rPr>
+        <w:t xml:space="preserve">чинаем выстраивать путь для </w:t>
+      </w:r>
+      <w:r>
+        <w:rPr>
+          <w:rFonts w:eastAsia="Times New Roman" w:cstheme="minorHAnsi"/>
+          <w:sz w:val="24"/>
+          <w:szCs w:val="24"/>
+          <w:lang w:eastAsia="ru-RU"/>
+        </w:rPr>
+        <w:t>необработанных</w:t>
+      </w:r>
+      <w:r>
+        <w:rPr>
+          <w:rFonts w:eastAsia="Times New Roman" w:cstheme="minorHAnsi"/>
+          <w:sz w:val="24"/>
+          <w:szCs w:val="24"/>
+          <w:lang w:eastAsia="ru-RU"/>
+        </w:rPr>
+        <w:t xml:space="preserve"> ячеек, у которых есть хотя бы один сосед-линия</w:t>
+      </w:r>
+      <w:r>
+        <w:rPr>
+          <w:rFonts w:eastAsia="Times New Roman" w:cstheme="minorHAnsi"/>
+          <w:sz w:val="24"/>
+          <w:szCs w:val="24"/>
+          <w:lang w:eastAsia="ru-RU"/>
+        </w:rPr>
+        <w:t>, находящийся слева, справа, сверху или снизу текущей ячейки</w:t>
       </w:r>
       <w:r>
         <w:rPr>
@@ -1155,79 +1682,128 @@
           <w:szCs w:val="24"/>
           <w:lang w:eastAsia="ru-RU"/>
         </w:rPr>
-        <w:t>Соответственно, если при проверке двух рядом стоящих ячеек x и x+1 или y и y+1 та, что стоит ниже или правее, не находится в списке допустимых наложений для ячейки по х или у</w:t>
-      </w:r>
-      <w:r>
-        <w:rPr>
-          <w:rFonts w:eastAsia="Times New Roman" w:cstheme="minorHAnsi"/>
-          <w:sz w:val="24"/>
-          <w:szCs w:val="24"/>
-          <w:lang w:eastAsia="ru-RU"/>
-        </w:rPr>
-        <w:t>, идем к следующе</w:t>
-      </w:r>
-      <w:r>
-        <w:rPr>
-          <w:rFonts w:eastAsia="Times New Roman" w:cstheme="minorHAnsi"/>
-          <w:sz w:val="24"/>
-          <w:szCs w:val="24"/>
-          <w:lang w:eastAsia="ru-RU"/>
-        </w:rPr>
-        <w:t>й комбинации линий</w:t>
-      </w:r>
-      <w:r>
-        <w:rPr>
-          <w:rFonts w:eastAsia="Times New Roman" w:cstheme="minorHAnsi"/>
-          <w:sz w:val="24"/>
-          <w:szCs w:val="24"/>
-          <w:lang w:eastAsia="ru-RU"/>
-        </w:rPr>
-        <w:t xml:space="preserve"> по основному циклу</w:t>
-      </w:r>
-      <w:r>
-        <w:rPr>
-          <w:rFonts w:eastAsia="Times New Roman" w:cstheme="minorHAnsi"/>
-          <w:sz w:val="24"/>
-          <w:szCs w:val="24"/>
-          <w:lang w:eastAsia="ru-RU"/>
-        </w:rPr>
-        <w:t xml:space="preserve">. Если нашли подходящую – </w:t>
-      </w:r>
-      <w:r>
-        <w:rPr>
-          <w:rFonts w:eastAsia="Times New Roman" w:cstheme="minorHAnsi"/>
-          <w:sz w:val="24"/>
-          <w:szCs w:val="24"/>
-          <w:lang w:eastAsia="ru-RU"/>
-        </w:rPr>
-        <w:t xml:space="preserve">сразу возвращаем результат с </w:t>
-      </w:r>
-      <w:r>
-        <w:rPr>
-          <w:rFonts w:eastAsia="Times New Roman" w:cstheme="minorHAnsi"/>
-          <w:sz w:val="24"/>
-          <w:szCs w:val="24"/>
-          <w:lang w:eastAsia="ru-RU"/>
-        </w:rPr>
-        <w:t>true</w:t>
-      </w:r>
-      <w:r>
-        <w:rPr>
-          <w:rFonts w:eastAsia="Times New Roman" w:cstheme="minorHAnsi"/>
-          <w:sz w:val="24"/>
-          <w:szCs w:val="24"/>
-          <w:lang w:eastAsia="ru-RU"/>
-        </w:rPr>
-        <w:t xml:space="preserve"> и текущей комбинацией позиций линий</w:t>
-      </w:r>
-      <w:r>
-        <w:rPr>
-          <w:rFonts w:eastAsia="Times New Roman" w:cstheme="minorHAnsi"/>
-          <w:sz w:val="24"/>
-          <w:szCs w:val="24"/>
-          <w:lang w:eastAsia="ru-RU"/>
-        </w:rPr>
-        <w:t>. Если из всех возможных позиций линий ни одна не вернула true, то возвращаем false.</w:t>
+        <w:t>Но выбираем мы ту клетку, у которой максимальное кол-во соседей (так шанс того, что мы подберем более верную линию в это место</w:t>
+      </w:r>
+      <w:r>
+        <w:rPr>
+          <w:rFonts w:eastAsia="Times New Roman" w:cstheme="minorHAnsi"/>
+          <w:sz w:val="24"/>
+          <w:szCs w:val="24"/>
+          <w:lang w:eastAsia="ru-RU"/>
+        </w:rPr>
+        <w:t>,</w:t>
+      </w:r>
+      <w:r>
+        <w:rPr>
+          <w:rFonts w:eastAsia="Times New Roman" w:cstheme="minorHAnsi"/>
+          <w:sz w:val="24"/>
+          <w:szCs w:val="24"/>
+          <w:lang w:eastAsia="ru-RU"/>
+        </w:rPr>
+        <w:t xml:space="preserve"> повышается). </w:t>
+      </w:r>
+      <w:r>
+        <w:rPr>
+          <w:rFonts w:eastAsia="Times New Roman" w:cstheme="minorHAnsi"/>
+          <w:sz w:val="24"/>
+          <w:szCs w:val="24"/>
+          <w:lang w:eastAsia="ru-RU"/>
+        </w:rPr>
+        <w:t xml:space="preserve">При этом сразу проверяется, что текущая позиция </w:t>
+      </w:r>
+      <w:r>
+        <w:rPr>
+          <w:rFonts w:eastAsia="Times New Roman" w:cstheme="minorHAnsi"/>
+          <w:sz w:val="24"/>
+          <w:szCs w:val="24"/>
+          <w:lang w:eastAsia="ru-RU"/>
+        </w:rPr>
+        <w:t xml:space="preserve">(перебор в цикле от 0 до 6) </w:t>
+      </w:r>
+      <w:r>
+        <w:rPr>
+          <w:rFonts w:eastAsia="Times New Roman" w:cstheme="minorHAnsi"/>
+          <w:sz w:val="24"/>
+          <w:szCs w:val="24"/>
+          <w:lang w:eastAsia="ru-RU"/>
+        </w:rPr>
+        <w:t xml:space="preserve">для линии является допустимой. Когда ни одна из позиций не может быть выставлена в эту ячейку - возвращаем </w:t>
+      </w:r>
+      <w:proofErr w:type="spellStart"/>
+      <w:r>
+        <w:rPr>
+          <w:rFonts w:eastAsia="Times New Roman" w:cstheme="minorHAnsi"/>
+          <w:sz w:val="24"/>
+          <w:szCs w:val="24"/>
+          <w:lang w:eastAsia="ru-RU"/>
+        </w:rPr>
+        <w:t>null</w:t>
+      </w:r>
+      <w:proofErr w:type="spellEnd"/>
+      <w:r>
+        <w:rPr>
+          <w:rFonts w:eastAsia="Times New Roman" w:cstheme="minorHAnsi"/>
+          <w:sz w:val="24"/>
+          <w:szCs w:val="24"/>
+          <w:lang w:eastAsia="ru-RU"/>
+        </w:rPr>
+        <w:t xml:space="preserve">. Если до этого путь </w:t>
+      </w:r>
+      <w:proofErr w:type="gramStart"/>
+      <w:r>
+        <w:rPr>
+          <w:rFonts w:eastAsia="Times New Roman" w:cstheme="minorHAnsi"/>
+          <w:sz w:val="24"/>
+          <w:szCs w:val="24"/>
+          <w:lang w:eastAsia="ru-RU"/>
+        </w:rPr>
+        <w:t>не оборвался</w:t>
+      </w:r>
+      <w:proofErr w:type="gramEnd"/>
+      <w:r>
+        <w:rPr>
+          <w:rFonts w:eastAsia="Times New Roman" w:cstheme="minorHAnsi"/>
+          <w:sz w:val="24"/>
+          <w:szCs w:val="24"/>
+          <w:lang w:eastAsia="ru-RU"/>
+        </w:rPr>
+        <w:t xml:space="preserve"> и мы дошли до конца матрицы и не можем найти </w:t>
+      </w:r>
+      <w:r>
+        <w:rPr>
+          <w:rFonts w:eastAsia="Times New Roman" w:cstheme="minorHAnsi"/>
+          <w:sz w:val="24"/>
+          <w:szCs w:val="24"/>
+          <w:lang w:eastAsia="ru-RU"/>
+        </w:rPr>
+        <w:t>необработанную</w:t>
+      </w:r>
+      <w:r>
+        <w:rPr>
+          <w:rFonts w:eastAsia="Times New Roman" w:cstheme="minorHAnsi"/>
+          <w:sz w:val="24"/>
+          <w:szCs w:val="24"/>
+          <w:lang w:eastAsia="ru-RU"/>
+        </w:rPr>
+        <w:t xml:space="preserve"> ячейку с соседом, </w:t>
+      </w:r>
+      <w:r>
+        <w:rPr>
+          <w:rFonts w:eastAsia="Times New Roman" w:cstheme="minorHAnsi"/>
+          <w:sz w:val="24"/>
+          <w:szCs w:val="24"/>
+          <w:lang w:eastAsia="ru-RU"/>
+        </w:rPr>
+        <w:t>то</w:t>
+      </w:r>
+      <w:r>
+        <w:rPr>
+          <w:rFonts w:eastAsia="Times New Roman" w:cstheme="minorHAnsi"/>
+          <w:sz w:val="24"/>
+          <w:szCs w:val="24"/>
+          <w:lang w:eastAsia="ru-RU"/>
+        </w:rPr>
+        <w:t xml:space="preserve"> проверяем наш получившийся путь на замкнутость. </w:t>
       </w:r>
     </w:p>
     <w:p>
@@ -1235,8 +1811,28 @@
         <w:spacing w:before="100" w:beforeAutospacing="1" w:after="100" w:afterAutospacing="1" w:line="240" w:lineRule="auto"/>
         <w:rPr>
           <w:rFonts w:cstheme="minorHAnsi"/>
+          <w:sz w:val="24"/>
+          <w:szCs w:val="24"/>
         </w:rPr>
       </w:pPr>
+      <w:r>
+        <w:rPr>
+          <w:rFonts w:cstheme="minorHAnsi"/>
+          <w:sz w:val="24"/>
+          <w:szCs w:val="24"/>
+        </w:rPr>
+        <w:t xml:space="preserve">5. Проверяем линию на замкнутость. Для этого сначала находим непустую клетку с линией, стартуем путь из нее. Заводим матрицу с булевыми значениями с </w:t>
+      </w:r>
+      <w:bookmarkStart w:id="0" w:name="_GoBack"/>
+      <w:bookmarkEnd w:id="0"/>
+      <w:r>
+        <w:rPr>
+          <w:rFonts w:cstheme="minorHAnsi"/>
+          <w:sz w:val="24"/>
+          <w:szCs w:val="24"/>
+        </w:rPr>
+        <w:t>отметками о посещении линий всей матрицы. Из стартовой клетки запускаем метод с попыткой двинуться дальше: если мы можем из нее уйти вправо/вниз/влево/вверх (можем = в следующей клетке есть линия, мы не посещали ее ни разу, следующая клетка имеет допустимое соединение с текущей клеткой), запускаем рекурсивно этот же метод для нее. Когда клетки для движения кончатся, мы проходим в цикле всю матрицу и проверяем, что все линии были посещены. Если хоть какая-то не была = путь не замкнут.</w:t>
+      </w:r>
     </w:p>
     <w:sectPr>
       <w:pgSz w:w="11906" w:h="16838"/>

</xml_diff>